<commit_message>
lab04 bai 1 phan 2 dockerfile
</commit_message>
<xml_diff>
--- a/Lab4/MinhChungTuan04.docx
+++ b/Lab4/MinhChungTuan04.docx
@@ -3,11 +3,1595 @@
 <w:document xmlns:wpc="http://schemas.microsoft.com/office/word/2010/wordprocessingCanvas" xmlns:mc="http://schemas.openxmlformats.org/markup-compatibility/2006" xmlns:o="urn:schemas-microsoft-com:office:office" xmlns:r="http://schemas.openxmlformats.org/officeDocument/2006/relationships" xmlns:m="http://schemas.openxmlformats.org/officeDocument/2006/math" xmlns:v="urn:schemas-microsoft-com:vml" xmlns:wp14="http://schemas.microsoft.com/office/word/2010/wordprocessingDrawing" xmlns:wp="http://schemas.openxmlformats.org/drawingml/2006/wordprocessingDrawing" xmlns:w10="urn:schemas-microsoft-com:office:word" xmlns:w="http://schemas.openxmlformats.org/wordprocessingml/2006/main" xmlns:w14="http://schemas.microsoft.com/office/word/2010/wordml" xmlns:w15="http://schemas.microsoft.com/office/word/2012/wordml" xmlns:wpg="http://schemas.microsoft.com/office/word/2010/wordprocessingGroup" xmlns:wpi="http://schemas.microsoft.com/office/word/2010/wordprocessingInk" xmlns:wne="http://schemas.microsoft.com/office/word/2006/wordml" xmlns:wps="http://schemas.microsoft.com/office/word/2010/wordprocessingShape" mc:Ignorable="w14 w15 wp14">
   <w:body>
     <w:p>
-      <w:r>
-        <w:t>addss</w:t>
-      </w:r>
+      <w:pPr>
+        <w:jc w:val="center"/>
+        <w:rPr>
+          <w:rFonts w:ascii="Times New Roman" w:hAnsi="Times New Roman" w:cs="Times New Roman"/>
+          <w:b/>
+        </w:rPr>
+      </w:pPr>
+      <w:r>
+        <w:rPr>
+          <w:rFonts w:ascii="Times New Roman" w:hAnsi="Times New Roman" w:cs="Times New Roman"/>
+          <w:b/>
+        </w:rPr>
+        <w:t>Tuần 04</w:t>
+      </w:r>
+    </w:p>
+    <w:p>
+      <w:pPr>
+        <w:jc w:val="center"/>
+        <w:rPr>
+          <w:rFonts w:ascii="Times New Roman" w:hAnsi="Times New Roman" w:cs="Times New Roman"/>
+        </w:rPr>
+      </w:pPr>
+    </w:p>
+    <w:p>
+      <w:pPr>
+        <w:rPr>
+          <w:rFonts w:ascii="Times New Roman" w:eastAsia="Times New Roman" w:hAnsi="Times New Roman" w:cs="Times New Roman"/>
+          <w:bCs/>
+          <w:sz w:val="24"/>
+          <w:szCs w:val="24"/>
+        </w:rPr>
+      </w:pPr>
+      <w:r>
+        <w:rPr>
+          <w:rFonts w:ascii="Times New Roman" w:hAnsi="Times New Roman" w:cs="Times New Roman"/>
+        </w:rPr>
+        <w:t xml:space="preserve">Phần 1: </w:t>
+      </w:r>
+      <w:r>
+        <w:rPr>
+          <w:rFonts w:ascii="Times New Roman" w:eastAsia="Times New Roman" w:hAnsi="Times New Roman" w:cs="Times New Roman"/>
+          <w:bCs/>
+          <w:sz w:val="24"/>
+          <w:szCs w:val="24"/>
+        </w:rPr>
+        <w:t>Các lệnh cơ bản thao tác với Docker</w:t>
+      </w:r>
+    </w:p>
+    <w:p>
+      <w:pPr>
+        <w:pStyle w:val="ListParagraph"/>
+        <w:numPr>
+          <w:ilvl w:val="0"/>
+          <w:numId w:val="1"/>
+        </w:numPr>
+        <w:rPr>
+          <w:rFonts w:ascii="Times New Roman" w:eastAsia="Times New Roman" w:hAnsi="Times New Roman" w:cs="Times New Roman"/>
+          <w:bCs/>
+          <w:sz w:val="24"/>
+          <w:szCs w:val="24"/>
+        </w:rPr>
+      </w:pPr>
+      <w:r>
+        <w:rPr>
+          <w:rFonts w:ascii="Times New Roman" w:hAnsi="Times New Roman" w:cs="Times New Roman"/>
+        </w:rPr>
+        <w:t xml:space="preserve">docker </w:t>
+      </w:r>
+      <w:r>
+        <w:rPr>
+          <w:rFonts w:ascii="Times New Roman" w:hAnsi="Times New Roman" w:cs="Times New Roman"/>
+        </w:rPr>
+        <w:t>–</w:t>
+      </w:r>
+      <w:r>
+        <w:rPr>
+          <w:rFonts w:ascii="Times New Roman" w:hAnsi="Times New Roman" w:cs="Times New Roman"/>
+        </w:rPr>
+        <w:t>version</w:t>
+      </w:r>
+    </w:p>
+    <w:p>
+      <w:pPr>
+        <w:rPr>
+          <w:rFonts w:ascii="Times New Roman" w:eastAsia="Times New Roman" w:hAnsi="Times New Roman" w:cs="Times New Roman"/>
+          <w:bCs/>
+          <w:sz w:val="24"/>
+          <w:szCs w:val="24"/>
+        </w:rPr>
+      </w:pPr>
+      <w:r>
+        <w:rPr>
+          <w:rFonts w:ascii="Times New Roman" w:eastAsia="Times New Roman" w:hAnsi="Times New Roman" w:cs="Times New Roman"/>
+          <w:bCs/>
+          <w:sz w:val="24"/>
+          <w:szCs w:val="24"/>
+        </w:rPr>
+        <w:drawing>
+          <wp:inline distT="0" distB="0" distL="0" distR="0" wp14:anchorId="6B34DB81" wp14:editId="2729926A">
+            <wp:extent cx="5943600" cy="3343275"/>
+            <wp:effectExtent l="0" t="0" r="0" b="9525"/>
+            <wp:docPr id="1" name="Picture 1"/>
+            <wp:cNvGraphicFramePr>
+              <a:graphicFrameLocks xmlns:a="http://schemas.openxmlformats.org/drawingml/2006/main" noChangeAspect="1"/>
+            </wp:cNvGraphicFramePr>
+            <a:graphic xmlns:a="http://schemas.openxmlformats.org/drawingml/2006/main">
+              <a:graphicData uri="http://schemas.openxmlformats.org/drawingml/2006/picture">
+                <pic:pic xmlns:pic="http://schemas.openxmlformats.org/drawingml/2006/picture">
+                  <pic:nvPicPr>
+                    <pic:cNvPr id="1" name=""/>
+                    <pic:cNvPicPr/>
+                  </pic:nvPicPr>
+                  <pic:blipFill>
+                    <a:blip r:embed="rId5"/>
+                    <a:stretch>
+                      <a:fillRect/>
+                    </a:stretch>
+                  </pic:blipFill>
+                  <pic:spPr>
+                    <a:xfrm>
+                      <a:off x="0" y="0"/>
+                      <a:ext cx="5943600" cy="3343275"/>
+                    </a:xfrm>
+                    <a:prstGeom prst="rect">
+                      <a:avLst/>
+                    </a:prstGeom>
+                  </pic:spPr>
+                </pic:pic>
+              </a:graphicData>
+            </a:graphic>
+          </wp:inline>
+        </w:drawing>
+      </w:r>
+    </w:p>
+    <w:p>
+      <w:pPr>
+        <w:pStyle w:val="ListParagraph"/>
+        <w:numPr>
+          <w:ilvl w:val="0"/>
+          <w:numId w:val="1"/>
+        </w:numPr>
+        <w:rPr>
+          <w:rFonts w:ascii="Times New Roman" w:eastAsia="Times New Roman" w:hAnsi="Times New Roman" w:cs="Times New Roman"/>
+          <w:bCs/>
+          <w:sz w:val="24"/>
+          <w:szCs w:val="24"/>
+        </w:rPr>
+      </w:pPr>
+      <w:r>
+        <w:rPr>
+          <w:rFonts w:ascii="Times New Roman" w:hAnsi="Times New Roman" w:cs="Times New Roman"/>
+        </w:rPr>
+        <w:t>docker run hello-world</w:t>
+      </w:r>
+    </w:p>
+    <w:p>
+      <w:pPr>
+        <w:rPr>
+          <w:rFonts w:ascii="Times New Roman" w:eastAsia="Times New Roman" w:hAnsi="Times New Roman" w:cs="Times New Roman"/>
+          <w:bCs/>
+          <w:sz w:val="24"/>
+          <w:szCs w:val="24"/>
+        </w:rPr>
+      </w:pPr>
+    </w:p>
+    <w:p>
+      <w:pPr>
+        <w:pStyle w:val="ListParagraph"/>
+        <w:numPr>
+          <w:ilvl w:val="0"/>
+          <w:numId w:val="1"/>
+        </w:numPr>
+        <w:rPr>
+          <w:rFonts w:ascii="Times New Roman" w:eastAsia="Times New Roman" w:hAnsi="Times New Roman" w:cs="Times New Roman"/>
+          <w:bCs/>
+          <w:sz w:val="24"/>
+          <w:szCs w:val="24"/>
+        </w:rPr>
+      </w:pPr>
+      <w:r>
+        <w:rPr>
+          <w:rFonts w:ascii="Times New Roman" w:hAnsi="Times New Roman" w:cs="Times New Roman"/>
+        </w:rPr>
+        <w:t>docker pull nginx</w:t>
+      </w:r>
+    </w:p>
+    <w:p>
+      <w:pPr>
+        <w:pStyle w:val="ListParagraph"/>
+        <w:numPr>
+          <w:ilvl w:val="0"/>
+          <w:numId w:val="1"/>
+        </w:numPr>
+        <w:rPr>
+          <w:rFonts w:ascii="Times New Roman" w:eastAsia="Times New Roman" w:hAnsi="Times New Roman" w:cs="Times New Roman"/>
+          <w:bCs/>
+          <w:sz w:val="24"/>
+          <w:szCs w:val="24"/>
+        </w:rPr>
+      </w:pPr>
+      <w:r>
+        <w:rPr>
+          <w:rFonts w:ascii="Times New Roman" w:hAnsi="Times New Roman" w:cs="Times New Roman"/>
+        </w:rPr>
+        <w:t>docker images</w:t>
+      </w:r>
+    </w:p>
+    <w:p>
+      <w:pPr>
+        <w:pStyle w:val="ListParagraph"/>
+        <w:numPr>
+          <w:ilvl w:val="0"/>
+          <w:numId w:val="1"/>
+        </w:numPr>
+        <w:rPr>
+          <w:rFonts w:ascii="Times New Roman" w:eastAsia="Times New Roman" w:hAnsi="Times New Roman" w:cs="Times New Roman"/>
+          <w:bCs/>
+          <w:sz w:val="24"/>
+          <w:szCs w:val="24"/>
+        </w:rPr>
+      </w:pPr>
+      <w:r>
+        <w:rPr>
+          <w:rFonts w:ascii="Times New Roman" w:hAnsi="Times New Roman" w:cs="Times New Roman"/>
+        </w:rPr>
+        <w:t>docker run -d nginx</w:t>
+      </w:r>
+    </w:p>
+    <w:p>
+      <w:pPr>
+        <w:pStyle w:val="ListParagraph"/>
+        <w:numPr>
+          <w:ilvl w:val="0"/>
+          <w:numId w:val="1"/>
+        </w:numPr>
+        <w:rPr>
+          <w:rFonts w:ascii="Times New Roman" w:eastAsia="Times New Roman" w:hAnsi="Times New Roman" w:cs="Times New Roman"/>
+          <w:bCs/>
+          <w:sz w:val="24"/>
+          <w:szCs w:val="24"/>
+        </w:rPr>
+      </w:pPr>
+      <w:r>
+        <w:rPr>
+          <w:rFonts w:ascii="Times New Roman" w:hAnsi="Times New Roman" w:cs="Times New Roman"/>
+        </w:rPr>
+        <w:t>docker ps</w:t>
+      </w:r>
+    </w:p>
+    <w:p>
+      <w:pPr>
+        <w:pStyle w:val="ListParagraph"/>
+        <w:numPr>
+          <w:ilvl w:val="0"/>
+          <w:numId w:val="1"/>
+        </w:numPr>
+        <w:rPr>
+          <w:rFonts w:ascii="Times New Roman" w:eastAsia="Times New Roman" w:hAnsi="Times New Roman" w:cs="Times New Roman"/>
+          <w:bCs/>
+          <w:sz w:val="24"/>
+          <w:szCs w:val="24"/>
+        </w:rPr>
+      </w:pPr>
+      <w:r>
+        <w:rPr>
+          <w:rFonts w:ascii="Times New Roman" w:hAnsi="Times New Roman" w:cs="Times New Roman"/>
+        </w:rPr>
+        <w:t xml:space="preserve">docker ps </w:t>
+      </w:r>
+      <w:r>
+        <w:rPr>
+          <w:rFonts w:ascii="Times New Roman" w:hAnsi="Times New Roman" w:cs="Times New Roman"/>
+        </w:rPr>
+        <w:t>–</w:t>
+      </w:r>
+      <w:r>
+        <w:rPr>
+          <w:rFonts w:ascii="Times New Roman" w:hAnsi="Times New Roman" w:cs="Times New Roman"/>
+        </w:rPr>
+        <w:t>a</w:t>
+      </w:r>
+    </w:p>
+    <w:p>
+      <w:pPr>
+        <w:pStyle w:val="ListParagraph"/>
+        <w:numPr>
+          <w:ilvl w:val="0"/>
+          <w:numId w:val="1"/>
+        </w:numPr>
+        <w:rPr>
+          <w:rFonts w:ascii="Times New Roman" w:eastAsia="Times New Roman" w:hAnsi="Times New Roman" w:cs="Times New Roman"/>
+          <w:bCs/>
+          <w:sz w:val="24"/>
+          <w:szCs w:val="24"/>
+        </w:rPr>
+      </w:pPr>
+      <w:r>
+        <w:rPr>
+          <w:rFonts w:ascii="Times New Roman" w:hAnsi="Times New Roman" w:cs="Times New Roman"/>
+        </w:rPr>
+        <w:t>docker logs &lt;container_id&gt;</w:t>
+      </w:r>
+    </w:p>
+    <w:p>
+      <w:pPr>
+        <w:pStyle w:val="ListParagraph"/>
+        <w:numPr>
+          <w:ilvl w:val="0"/>
+          <w:numId w:val="1"/>
+        </w:numPr>
+        <w:rPr>
+          <w:rFonts w:ascii="Times New Roman" w:eastAsia="Times New Roman" w:hAnsi="Times New Roman" w:cs="Times New Roman"/>
+          <w:bCs/>
+          <w:sz w:val="24"/>
+          <w:szCs w:val="24"/>
+        </w:rPr>
+      </w:pPr>
+      <w:r>
+        <w:rPr>
+          <w:rFonts w:ascii="Times New Roman" w:hAnsi="Times New Roman" w:cs="Times New Roman"/>
+        </w:rPr>
+        <w:t>docker exec -it &lt;container_id&gt; /bin/sh</w:t>
+      </w:r>
+    </w:p>
+    <w:p>
+      <w:pPr>
+        <w:pStyle w:val="ListParagraph"/>
+        <w:numPr>
+          <w:ilvl w:val="0"/>
+          <w:numId w:val="1"/>
+        </w:numPr>
+        <w:rPr>
+          <w:rFonts w:ascii="Times New Roman" w:eastAsia="Times New Roman" w:hAnsi="Times New Roman" w:cs="Times New Roman"/>
+          <w:bCs/>
+          <w:sz w:val="24"/>
+          <w:szCs w:val="24"/>
+        </w:rPr>
+      </w:pPr>
+      <w:r>
+        <w:rPr>
+          <w:rFonts w:ascii="Times New Roman" w:hAnsi="Times New Roman" w:cs="Times New Roman"/>
+        </w:rPr>
+        <w:t>docker stop &lt;container_id&gt;</w:t>
+      </w:r>
+    </w:p>
+    <w:p>
+      <w:pPr>
+        <w:pStyle w:val="ListParagraph"/>
+        <w:numPr>
+          <w:ilvl w:val="0"/>
+          <w:numId w:val="1"/>
+        </w:numPr>
+        <w:rPr>
+          <w:rFonts w:ascii="Times New Roman" w:eastAsia="Times New Roman" w:hAnsi="Times New Roman" w:cs="Times New Roman"/>
+          <w:bCs/>
+          <w:sz w:val="24"/>
+          <w:szCs w:val="24"/>
+        </w:rPr>
+      </w:pPr>
+      <w:r>
+        <w:rPr>
+          <w:rFonts w:ascii="Times New Roman" w:hAnsi="Times New Roman" w:cs="Times New Roman"/>
+        </w:rPr>
+        <w:t>docker restart &lt;container_id&gt;</w:t>
+      </w:r>
+    </w:p>
+    <w:p>
+      <w:pPr>
+        <w:pStyle w:val="ListParagraph"/>
+        <w:numPr>
+          <w:ilvl w:val="0"/>
+          <w:numId w:val="1"/>
+        </w:numPr>
+        <w:rPr>
+          <w:rFonts w:ascii="Times New Roman" w:eastAsia="Times New Roman" w:hAnsi="Times New Roman" w:cs="Times New Roman"/>
+          <w:bCs/>
+          <w:sz w:val="24"/>
+          <w:szCs w:val="24"/>
+        </w:rPr>
+      </w:pPr>
+      <w:r>
+        <w:rPr>
+          <w:rFonts w:ascii="Times New Roman" w:hAnsi="Times New Roman" w:cs="Times New Roman"/>
+        </w:rPr>
+        <w:t>docker rm &lt;container_id&gt;</w:t>
+      </w:r>
+    </w:p>
+    <w:p>
+      <w:pPr>
+        <w:pStyle w:val="ListParagraph"/>
+        <w:numPr>
+          <w:ilvl w:val="0"/>
+          <w:numId w:val="1"/>
+        </w:numPr>
+        <w:rPr>
+          <w:rFonts w:ascii="Times New Roman" w:eastAsia="Times New Roman" w:hAnsi="Times New Roman" w:cs="Times New Roman"/>
+          <w:bCs/>
+          <w:sz w:val="24"/>
+          <w:szCs w:val="24"/>
+        </w:rPr>
+      </w:pPr>
+      <w:r>
+        <w:rPr>
+          <w:rFonts w:ascii="Times New Roman" w:hAnsi="Times New Roman" w:cs="Times New Roman"/>
+        </w:rPr>
+        <w:t>docker container prune</w:t>
+      </w:r>
+    </w:p>
+    <w:p>
+      <w:pPr>
+        <w:pStyle w:val="ListParagraph"/>
+        <w:numPr>
+          <w:ilvl w:val="0"/>
+          <w:numId w:val="1"/>
+        </w:numPr>
+        <w:rPr>
+          <w:rFonts w:ascii="Times New Roman" w:eastAsia="Times New Roman" w:hAnsi="Times New Roman" w:cs="Times New Roman"/>
+          <w:bCs/>
+          <w:sz w:val="24"/>
+          <w:szCs w:val="24"/>
+        </w:rPr>
+      </w:pPr>
+      <w:r>
+        <w:rPr>
+          <w:rFonts w:ascii="Times New Roman" w:hAnsi="Times New Roman" w:cs="Times New Roman"/>
+        </w:rPr>
+        <w:t>docker rmi &lt;image_id&gt;</w:t>
+      </w:r>
+    </w:p>
+    <w:p>
+      <w:pPr>
+        <w:pStyle w:val="ListParagraph"/>
+        <w:numPr>
+          <w:ilvl w:val="0"/>
+          <w:numId w:val="1"/>
+        </w:numPr>
+        <w:rPr>
+          <w:rFonts w:ascii="Times New Roman" w:eastAsia="Times New Roman" w:hAnsi="Times New Roman" w:cs="Times New Roman"/>
+          <w:bCs/>
+          <w:sz w:val="24"/>
+          <w:szCs w:val="24"/>
+        </w:rPr>
+      </w:pPr>
+      <w:r>
+        <w:rPr>
+          <w:rFonts w:ascii="Times New Roman" w:hAnsi="Times New Roman" w:cs="Times New Roman"/>
+        </w:rPr>
+        <w:t xml:space="preserve">docker image prune </w:t>
+      </w:r>
+      <w:r>
+        <w:rPr>
+          <w:rFonts w:ascii="Times New Roman" w:hAnsi="Times New Roman" w:cs="Times New Roman"/>
+        </w:rPr>
+        <w:t>–</w:t>
+      </w:r>
+      <w:r>
+        <w:rPr>
+          <w:rFonts w:ascii="Times New Roman" w:hAnsi="Times New Roman" w:cs="Times New Roman"/>
+        </w:rPr>
+        <w:t>a</w:t>
+      </w:r>
+    </w:p>
+    <w:p>
+      <w:pPr>
+        <w:pStyle w:val="ListParagraph"/>
+        <w:numPr>
+          <w:ilvl w:val="0"/>
+          <w:numId w:val="1"/>
+        </w:numPr>
+        <w:rPr>
+          <w:rFonts w:ascii="Times New Roman" w:eastAsia="Times New Roman" w:hAnsi="Times New Roman" w:cs="Times New Roman"/>
+          <w:bCs/>
+          <w:sz w:val="24"/>
+          <w:szCs w:val="24"/>
+        </w:rPr>
+      </w:pPr>
+      <w:r>
+        <w:rPr>
+          <w:rFonts w:ascii="Times New Roman" w:hAnsi="Times New Roman" w:cs="Times New Roman"/>
+        </w:rPr>
+        <w:t>docker run -d -p 8080:80 nginx</w:t>
+      </w:r>
+    </w:p>
+    <w:p>
+      <w:pPr>
+        <w:pStyle w:val="ListParagraph"/>
+        <w:numPr>
+          <w:ilvl w:val="0"/>
+          <w:numId w:val="1"/>
+        </w:numPr>
+        <w:rPr>
+          <w:rFonts w:ascii="Times New Roman" w:eastAsia="Times New Roman" w:hAnsi="Times New Roman" w:cs="Times New Roman"/>
+          <w:bCs/>
+          <w:sz w:val="24"/>
+          <w:szCs w:val="24"/>
+        </w:rPr>
+      </w:pPr>
+      <w:r>
+        <w:rPr>
+          <w:rFonts w:ascii="Times New Roman" w:hAnsi="Times New Roman" w:cs="Times New Roman"/>
+        </w:rPr>
+        <w:t>docker inspect &lt;container_id&gt;</w:t>
+      </w:r>
+    </w:p>
+    <w:p>
+      <w:pPr>
+        <w:pStyle w:val="ListParagraph"/>
+        <w:numPr>
+          <w:ilvl w:val="0"/>
+          <w:numId w:val="1"/>
+        </w:numPr>
+        <w:rPr>
+          <w:rFonts w:ascii="Times New Roman" w:eastAsia="Times New Roman" w:hAnsi="Times New Roman" w:cs="Times New Roman"/>
+          <w:bCs/>
+          <w:sz w:val="24"/>
+          <w:szCs w:val="24"/>
+        </w:rPr>
+      </w:pPr>
+      <w:r>
+        <w:rPr>
+          <w:rFonts w:ascii="Times New Roman" w:hAnsi="Times New Roman" w:cs="Times New Roman"/>
+        </w:rPr>
+        <w:t>docker run -d -v mydata:/data nginx</w:t>
+      </w:r>
+    </w:p>
+    <w:p>
+      <w:pPr>
+        <w:pStyle w:val="ListParagraph"/>
+        <w:numPr>
+          <w:ilvl w:val="0"/>
+          <w:numId w:val="1"/>
+        </w:numPr>
+        <w:rPr>
+          <w:rFonts w:ascii="Times New Roman" w:eastAsia="Times New Roman" w:hAnsi="Times New Roman" w:cs="Times New Roman"/>
+          <w:bCs/>
+          <w:sz w:val="24"/>
+          <w:szCs w:val="24"/>
+        </w:rPr>
+      </w:pPr>
+      <w:r>
+        <w:rPr>
+          <w:rFonts w:ascii="Times New Roman" w:hAnsi="Times New Roman" w:cs="Times New Roman"/>
+        </w:rPr>
+        <w:lastRenderedPageBreak/>
+        <w:t>docker volume ls</w:t>
+      </w:r>
+    </w:p>
+    <w:p>
+      <w:pPr>
+        <w:pStyle w:val="ListParagraph"/>
+        <w:numPr>
+          <w:ilvl w:val="0"/>
+          <w:numId w:val="1"/>
+        </w:numPr>
+        <w:rPr>
+          <w:rFonts w:ascii="Times New Roman" w:eastAsia="Times New Roman" w:hAnsi="Times New Roman" w:cs="Times New Roman"/>
+          <w:bCs/>
+          <w:sz w:val="24"/>
+          <w:szCs w:val="24"/>
+        </w:rPr>
+      </w:pPr>
+      <w:r>
+        <w:rPr>
+          <w:rFonts w:ascii="Times New Roman" w:hAnsi="Times New Roman" w:cs="Times New Roman"/>
+        </w:rPr>
+        <w:t>docker volume prune</w:t>
+      </w:r>
+    </w:p>
+    <w:p>
+      <w:pPr>
+        <w:pStyle w:val="ListParagraph"/>
+        <w:numPr>
+          <w:ilvl w:val="0"/>
+          <w:numId w:val="1"/>
+        </w:numPr>
+        <w:rPr>
+          <w:rFonts w:ascii="Times New Roman" w:eastAsia="Times New Roman" w:hAnsi="Times New Roman" w:cs="Times New Roman"/>
+          <w:bCs/>
+          <w:sz w:val="24"/>
+          <w:szCs w:val="24"/>
+        </w:rPr>
+      </w:pPr>
+      <w:r>
+        <w:rPr>
+          <w:rFonts w:ascii="Times New Roman" w:hAnsi="Times New Roman" w:cs="Times New Roman"/>
+        </w:rPr>
+        <w:t>docker run -d --name my_nginx nginx</w:t>
+      </w:r>
+    </w:p>
+    <w:p>
+      <w:pPr>
+        <w:pStyle w:val="ListParagraph"/>
+        <w:numPr>
+          <w:ilvl w:val="0"/>
+          <w:numId w:val="1"/>
+        </w:numPr>
+        <w:rPr>
+          <w:rFonts w:ascii="Times New Roman" w:eastAsia="Times New Roman" w:hAnsi="Times New Roman" w:cs="Times New Roman"/>
+          <w:bCs/>
+          <w:sz w:val="24"/>
+          <w:szCs w:val="24"/>
+        </w:rPr>
+      </w:pPr>
+      <w:r>
+        <w:rPr>
+          <w:rFonts w:ascii="Times New Roman" w:hAnsi="Times New Roman" w:cs="Times New Roman"/>
+        </w:rPr>
+        <w:t>docker stats</w:t>
+      </w:r>
+    </w:p>
+    <w:p>
+      <w:pPr>
+        <w:pStyle w:val="ListParagraph"/>
+        <w:numPr>
+          <w:ilvl w:val="0"/>
+          <w:numId w:val="1"/>
+        </w:numPr>
+        <w:rPr>
+          <w:rFonts w:ascii="Times New Roman" w:eastAsia="Times New Roman" w:hAnsi="Times New Roman" w:cs="Times New Roman"/>
+          <w:bCs/>
+          <w:sz w:val="24"/>
+          <w:szCs w:val="24"/>
+        </w:rPr>
+      </w:pPr>
+      <w:r>
+        <w:rPr>
+          <w:rFonts w:ascii="Times New Roman" w:hAnsi="Times New Roman" w:cs="Times New Roman"/>
+        </w:rPr>
+        <w:t>docker network ls</w:t>
+      </w:r>
+    </w:p>
+    <w:p>
+      <w:pPr>
+        <w:pStyle w:val="ListParagraph"/>
+        <w:numPr>
+          <w:ilvl w:val="0"/>
+          <w:numId w:val="1"/>
+        </w:numPr>
+        <w:rPr>
+          <w:rFonts w:ascii="Times New Roman" w:eastAsia="Times New Roman" w:hAnsi="Times New Roman" w:cs="Times New Roman"/>
+          <w:bCs/>
+          <w:sz w:val="24"/>
+          <w:szCs w:val="24"/>
+        </w:rPr>
+      </w:pPr>
+      <w:r>
+        <w:rPr>
+          <w:rFonts w:ascii="Times New Roman" w:hAnsi="Times New Roman" w:cs="Times New Roman"/>
+        </w:rPr>
+        <w:t>docker network create my_network</w:t>
+      </w:r>
+    </w:p>
+    <w:p>
+      <w:pPr>
+        <w:pStyle w:val="ListParagraph"/>
+        <w:numPr>
+          <w:ilvl w:val="0"/>
+          <w:numId w:val="1"/>
+        </w:numPr>
+        <w:rPr>
+          <w:rFonts w:ascii="Times New Roman" w:eastAsia="Times New Roman" w:hAnsi="Times New Roman" w:cs="Times New Roman"/>
+          <w:bCs/>
+          <w:sz w:val="24"/>
+          <w:szCs w:val="24"/>
+        </w:rPr>
+      </w:pPr>
+      <w:r>
+        <w:rPr>
+          <w:rFonts w:ascii="Times New Roman" w:hAnsi="Times New Roman" w:cs="Times New Roman"/>
+        </w:rPr>
+        <w:t>docker run -d --network my_network --name my_container nginx</w:t>
+      </w:r>
+    </w:p>
+    <w:p>
+      <w:pPr>
+        <w:pStyle w:val="ListParagraph"/>
+        <w:numPr>
+          <w:ilvl w:val="0"/>
+          <w:numId w:val="1"/>
+        </w:numPr>
+        <w:rPr>
+          <w:rFonts w:ascii="Times New Roman" w:eastAsia="Times New Roman" w:hAnsi="Times New Roman" w:cs="Times New Roman"/>
+          <w:bCs/>
+          <w:sz w:val="24"/>
+          <w:szCs w:val="24"/>
+        </w:rPr>
+      </w:pPr>
+      <w:r>
+        <w:rPr>
+          <w:rFonts w:ascii="Times New Roman" w:hAnsi="Times New Roman" w:cs="Times New Roman"/>
+        </w:rPr>
+        <w:t>docker network connect my_network my_nginx</w:t>
+      </w:r>
+    </w:p>
+    <w:p>
+      <w:pPr>
+        <w:pStyle w:val="ListParagraph"/>
+        <w:numPr>
+          <w:ilvl w:val="0"/>
+          <w:numId w:val="1"/>
+        </w:numPr>
+        <w:rPr>
+          <w:rFonts w:ascii="Times New Roman" w:eastAsia="Times New Roman" w:hAnsi="Times New Roman" w:cs="Times New Roman"/>
+          <w:bCs/>
+          <w:sz w:val="24"/>
+          <w:szCs w:val="24"/>
+        </w:rPr>
+      </w:pPr>
+      <w:r>
+        <w:rPr>
+          <w:rFonts w:ascii="Times New Roman" w:hAnsi="Times New Roman" w:cs="Times New Roman"/>
+        </w:rPr>
+        <w:t>docker run -d -e MY_ENV=hello_world nginx</w:t>
+      </w:r>
+    </w:p>
+    <w:p>
+      <w:pPr>
+        <w:pStyle w:val="ListParagraph"/>
+        <w:numPr>
+          <w:ilvl w:val="0"/>
+          <w:numId w:val="1"/>
+        </w:numPr>
+        <w:rPr>
+          <w:rFonts w:ascii="Times New Roman" w:eastAsia="Times New Roman" w:hAnsi="Times New Roman" w:cs="Times New Roman"/>
+          <w:bCs/>
+          <w:sz w:val="24"/>
+          <w:szCs w:val="24"/>
+        </w:rPr>
+      </w:pPr>
+      <w:r>
+        <w:rPr>
+          <w:rFonts w:ascii="Times New Roman" w:hAnsi="Times New Roman" w:cs="Times New Roman"/>
+        </w:rPr>
+        <w:t>docker logs -f my_nginx</w:t>
+      </w:r>
+    </w:p>
+    <w:p>
+      <w:pPr>
+        <w:pStyle w:val="ListParagraph"/>
+        <w:numPr>
+          <w:ilvl w:val="0"/>
+          <w:numId w:val="1"/>
+        </w:numPr>
+        <w:rPr>
+          <w:rFonts w:ascii="Times New Roman" w:eastAsia="Times New Roman" w:hAnsi="Times New Roman" w:cs="Times New Roman"/>
+          <w:bCs/>
+          <w:sz w:val="24"/>
+          <w:szCs w:val="24"/>
+        </w:rPr>
+      </w:pPr>
+      <w:r>
+        <w:rPr>
+          <w:rFonts w:ascii="Times New Roman" w:hAnsi="Times New Roman" w:cs="Times New Roman"/>
+        </w:rPr>
+        <w:t>FROM nginx</w:t>
+      </w:r>
+      <w:r>
+        <w:rPr>
+          <w:rFonts w:ascii="Times New Roman" w:hAnsi="Times New Roman" w:cs="Times New Roman"/>
+        </w:rPr>
+        <w:t xml:space="preserve"> </w:t>
+      </w:r>
+      <w:r>
+        <w:rPr>
+          <w:rFonts w:ascii="Times New Roman" w:hAnsi="Times New Roman" w:cs="Times New Roman"/>
+        </w:rPr>
+        <w:t>COPY index.html /usr/share/nginx/html/index.html</w:t>
+      </w:r>
+    </w:p>
+    <w:p>
+      <w:pPr>
+        <w:pStyle w:val="ListParagraph"/>
+        <w:numPr>
+          <w:ilvl w:val="0"/>
+          <w:numId w:val="1"/>
+        </w:numPr>
+        <w:rPr>
+          <w:rFonts w:ascii="Times New Roman" w:eastAsia="Times New Roman" w:hAnsi="Times New Roman" w:cs="Times New Roman"/>
+          <w:bCs/>
+          <w:sz w:val="24"/>
+          <w:szCs w:val="24"/>
+        </w:rPr>
+      </w:pPr>
+      <w:proofErr w:type="gramStart"/>
+      <w:r>
+        <w:rPr>
+          <w:rFonts w:ascii="Times New Roman" w:hAnsi="Times New Roman" w:cs="Times New Roman"/>
+        </w:rPr>
+        <w:t>docker</w:t>
+      </w:r>
+      <w:proofErr w:type="gramEnd"/>
+      <w:r>
+        <w:rPr>
+          <w:rFonts w:ascii="Times New Roman" w:hAnsi="Times New Roman" w:cs="Times New Roman"/>
+        </w:rPr>
+        <w:t xml:space="preserve"> build -t my_nginx_image .</w:t>
+      </w:r>
+    </w:p>
+    <w:p>
+      <w:pPr>
+        <w:pStyle w:val="ListParagraph"/>
+        <w:numPr>
+          <w:ilvl w:val="0"/>
+          <w:numId w:val="1"/>
+        </w:numPr>
+        <w:rPr>
+          <w:rFonts w:ascii="Times New Roman" w:eastAsia="Times New Roman" w:hAnsi="Times New Roman" w:cs="Times New Roman"/>
+          <w:bCs/>
+          <w:sz w:val="24"/>
+          <w:szCs w:val="24"/>
+        </w:rPr>
+      </w:pPr>
+      <w:r>
+        <w:rPr>
+          <w:rFonts w:ascii="Times New Roman" w:hAnsi="Times New Roman" w:cs="Times New Roman"/>
+        </w:rPr>
+        <w:t>docker run -d -p 8080:80 my_nginx_image</w:t>
+      </w:r>
+    </w:p>
+    <w:p>
+      <w:pPr>
+        <w:rPr>
+          <w:rFonts w:ascii="Times New Roman" w:eastAsia="Times New Roman" w:hAnsi="Times New Roman" w:cs="Times New Roman"/>
+          <w:bCs/>
+          <w:sz w:val="24"/>
+          <w:szCs w:val="24"/>
+        </w:rPr>
+      </w:pPr>
+      <w:r>
+        <w:rPr>
+          <w:rFonts w:ascii="Times New Roman" w:eastAsia="Times New Roman" w:hAnsi="Times New Roman" w:cs="Times New Roman"/>
+          <w:bCs/>
+          <w:sz w:val="24"/>
+          <w:szCs w:val="24"/>
+        </w:rPr>
+        <w:t>Phần 2: Thao tác với Dockerfile</w:t>
+      </w:r>
+    </w:p>
+    <w:p>
+      <w:pPr>
+        <w:rPr>
+          <w:rFonts w:ascii="Times New Roman" w:hAnsi="Times New Roman" w:cs="Times New Roman"/>
+        </w:rPr>
+      </w:pPr>
       <w:bookmarkStart w:id="0" w:name="_GoBack"/>
-      <w:bookmarkEnd w:id="0"/>
+      <w:r>
+        <w:rPr>
+          <w:rFonts w:ascii="Times New Roman" w:eastAsia="Times New Roman" w:hAnsi="Times New Roman" w:cs="Times New Roman"/>
+          <w:bCs/>
+          <w:sz w:val="24"/>
+          <w:szCs w:val="24"/>
+        </w:rPr>
+        <w:t xml:space="preserve">Bài 1: </w:t>
+      </w:r>
+      <w:r>
+        <w:rPr>
+          <w:rFonts w:ascii="Times New Roman" w:hAnsi="Times New Roman" w:cs="Times New Roman"/>
+        </w:rPr>
+        <w:t>Tạo Dockerfile chạy một ứng dụng Node.js đơn giản</w:t>
+      </w:r>
+    </w:p>
+    <w:p>
+      <w:pPr>
+        <w:rPr>
+          <w:rFonts w:ascii="Times New Roman" w:hAnsi="Times New Roman" w:cs="Times New Roman"/>
+          <w:b/>
+          <w:bCs/>
+          <w:i/>
+          <w:iCs/>
+        </w:rPr>
+      </w:pPr>
+      <w:r>
+        <w:rPr>
+          <w:rFonts w:ascii="Times New Roman" w:hAnsi="Times New Roman" w:cs="Times New Roman"/>
+          <w:b/>
+          <w:bCs/>
+          <w:i/>
+          <w:iCs/>
+        </w:rPr>
+        <w:t>Yêu cầu:</w:t>
+      </w:r>
+    </w:p>
+    <w:p>
+      <w:pPr>
+        <w:rPr>
+          <w:rFonts w:ascii="Times New Roman" w:hAnsi="Times New Roman" w:cs="Times New Roman"/>
+        </w:rPr>
+      </w:pPr>
+      <w:r>
+        <w:rPr>
+          <w:rFonts w:ascii="Times New Roman" w:hAnsi="Times New Roman" w:cs="Times New Roman"/>
+        </w:rPr>
+        <w:t>Viết Dockerfile để chạy một ứng dụng Node.js hiển thị "Hello, Docker!" trên cổng 3000.</w:t>
+      </w:r>
+    </w:p>
+    <w:p>
+      <w:pPr>
+        <w:rPr>
+          <w:rFonts w:ascii="Times New Roman" w:hAnsi="Times New Roman" w:cs="Times New Roman"/>
+        </w:rPr>
+      </w:pPr>
+      <w:r>
+        <w:rPr>
+          <w:rFonts w:ascii="Times New Roman" w:hAnsi="Times New Roman" w:cs="Times New Roman"/>
+        </w:rPr>
+        <w:t>Sử dụng node</w:t>
+      </w:r>
+      <w:proofErr w:type="gramStart"/>
+      <w:r>
+        <w:rPr>
+          <w:rFonts w:ascii="Times New Roman" w:hAnsi="Times New Roman" w:cs="Times New Roman"/>
+        </w:rPr>
+        <w:t>:18</w:t>
+      </w:r>
+      <w:proofErr w:type="gramEnd"/>
+      <w:r>
+        <w:rPr>
+          <w:rFonts w:ascii="Times New Roman" w:hAnsi="Times New Roman" w:cs="Times New Roman"/>
+        </w:rPr>
+        <w:t xml:space="preserve"> làm base image.</w:t>
+      </w:r>
+    </w:p>
+    <w:bookmarkEnd w:id="0"/>
+    <w:p>
+      <w:pPr>
+        <w:rPr>
+          <w:rFonts w:ascii="Times New Roman" w:hAnsi="Times New Roman" w:cs="Times New Roman"/>
+        </w:rPr>
+      </w:pPr>
+      <w:r>
+        <w:rPr>
+          <w:rFonts w:ascii="Times New Roman" w:hAnsi="Times New Roman" w:cs="Times New Roman"/>
+        </w:rPr>
+        <w:t>Bài 2: Tạo Dockerfile chạy một ứng dụng Python Flask</w:t>
+      </w:r>
+    </w:p>
+    <w:p>
+      <w:pPr>
+        <w:rPr>
+          <w:rFonts w:ascii="Times New Roman" w:hAnsi="Times New Roman" w:cs="Times New Roman"/>
+          <w:b/>
+          <w:bCs/>
+          <w:i/>
+          <w:iCs/>
+        </w:rPr>
+      </w:pPr>
+      <w:r>
+        <w:rPr>
+          <w:rFonts w:ascii="Times New Roman" w:hAnsi="Times New Roman" w:cs="Times New Roman"/>
+          <w:b/>
+          <w:bCs/>
+          <w:i/>
+          <w:iCs/>
+        </w:rPr>
+        <w:t>Yêu cầu:</w:t>
+      </w:r>
+    </w:p>
+    <w:p>
+      <w:pPr>
+        <w:rPr>
+          <w:rFonts w:ascii="Times New Roman" w:hAnsi="Times New Roman" w:cs="Times New Roman"/>
+        </w:rPr>
+      </w:pPr>
+      <w:r>
+        <w:rPr>
+          <w:rFonts w:ascii="Times New Roman" w:hAnsi="Times New Roman" w:cs="Times New Roman"/>
+        </w:rPr>
+        <w:t>Viết Dockerfile để build và chạy một ứng dụng React.</w:t>
+      </w:r>
+    </w:p>
+    <w:p>
+      <w:pPr>
+        <w:rPr>
+          <w:rFonts w:ascii="Times New Roman" w:hAnsi="Times New Roman" w:cs="Times New Roman"/>
+        </w:rPr>
+      </w:pPr>
+      <w:r>
+        <w:rPr>
+          <w:rFonts w:ascii="Times New Roman" w:hAnsi="Times New Roman" w:cs="Times New Roman"/>
+        </w:rPr>
+        <w:t>Sử dụng node</w:t>
+      </w:r>
+      <w:proofErr w:type="gramStart"/>
+      <w:r>
+        <w:rPr>
+          <w:rFonts w:ascii="Times New Roman" w:hAnsi="Times New Roman" w:cs="Times New Roman"/>
+        </w:rPr>
+        <w:t>:18</w:t>
+      </w:r>
+      <w:proofErr w:type="gramEnd"/>
+      <w:r>
+        <w:rPr>
+          <w:rFonts w:ascii="Times New Roman" w:hAnsi="Times New Roman" w:cs="Times New Roman"/>
+        </w:rPr>
+        <w:t>-alpine làm base image.</w:t>
+      </w:r>
+    </w:p>
+    <w:p>
+      <w:pPr>
+        <w:rPr>
+          <w:rFonts w:ascii="Times New Roman" w:hAnsi="Times New Roman" w:cs="Times New Roman"/>
+        </w:rPr>
+      </w:pPr>
+      <w:r>
+        <w:rPr>
+          <w:rFonts w:ascii="Times New Roman" w:hAnsi="Times New Roman" w:cs="Times New Roman"/>
+        </w:rPr>
+        <w:t>Bài 3: Tạo Dockerfile chạy một ứng dụng React</w:t>
+      </w:r>
+    </w:p>
+    <w:p>
+      <w:pPr>
+        <w:rPr>
+          <w:rFonts w:ascii="Times New Roman" w:hAnsi="Times New Roman" w:cs="Times New Roman"/>
+          <w:b/>
+          <w:bCs/>
+          <w:i/>
+          <w:iCs/>
+        </w:rPr>
+      </w:pPr>
+      <w:r>
+        <w:rPr>
+          <w:rFonts w:ascii="Times New Roman" w:hAnsi="Times New Roman" w:cs="Times New Roman"/>
+          <w:b/>
+          <w:bCs/>
+          <w:i/>
+          <w:iCs/>
+        </w:rPr>
+        <w:t>Yêu cầu:</w:t>
+      </w:r>
+    </w:p>
+    <w:p>
+      <w:pPr>
+        <w:rPr>
+          <w:rFonts w:ascii="Times New Roman" w:hAnsi="Times New Roman" w:cs="Times New Roman"/>
+        </w:rPr>
+      </w:pPr>
+      <w:r>
+        <w:rPr>
+          <w:rFonts w:ascii="Times New Roman" w:hAnsi="Times New Roman" w:cs="Times New Roman"/>
+        </w:rPr>
+        <w:t>Viết Dockerfile để build và chạy một ứng dụng React.</w:t>
+      </w:r>
+    </w:p>
+    <w:p>
+      <w:pPr>
+        <w:rPr>
+          <w:rFonts w:ascii="Times New Roman" w:hAnsi="Times New Roman" w:cs="Times New Roman"/>
+        </w:rPr>
+      </w:pPr>
+      <w:r>
+        <w:rPr>
+          <w:rFonts w:ascii="Times New Roman" w:hAnsi="Times New Roman" w:cs="Times New Roman"/>
+        </w:rPr>
+        <w:t>Sử dụng node</w:t>
+      </w:r>
+      <w:proofErr w:type="gramStart"/>
+      <w:r>
+        <w:rPr>
+          <w:rFonts w:ascii="Times New Roman" w:hAnsi="Times New Roman" w:cs="Times New Roman"/>
+        </w:rPr>
+        <w:t>:18</w:t>
+      </w:r>
+      <w:proofErr w:type="gramEnd"/>
+      <w:r>
+        <w:rPr>
+          <w:rFonts w:ascii="Times New Roman" w:hAnsi="Times New Roman" w:cs="Times New Roman"/>
+        </w:rPr>
+        <w:t>-alpine làm base image.</w:t>
+      </w:r>
+    </w:p>
+    <w:p>
+      <w:pPr>
+        <w:rPr>
+          <w:rFonts w:ascii="Times New Roman" w:hAnsi="Times New Roman" w:cs="Times New Roman"/>
+        </w:rPr>
+      </w:pPr>
+      <w:r>
+        <w:rPr>
+          <w:rFonts w:ascii="Times New Roman" w:hAnsi="Times New Roman" w:cs="Times New Roman"/>
+        </w:rPr>
+        <w:t>Bài 4: Tạo Dockerfile chạy một trang web tĩnh bằng Nginx</w:t>
+      </w:r>
+    </w:p>
+    <w:p>
+      <w:pPr>
+        <w:rPr>
+          <w:rFonts w:ascii="Times New Roman" w:hAnsi="Times New Roman" w:cs="Times New Roman"/>
+          <w:b/>
+          <w:bCs/>
+          <w:i/>
+          <w:iCs/>
+        </w:rPr>
+      </w:pPr>
+      <w:r>
+        <w:rPr>
+          <w:rFonts w:ascii="Times New Roman" w:hAnsi="Times New Roman" w:cs="Times New Roman"/>
+          <w:b/>
+          <w:bCs/>
+          <w:i/>
+          <w:iCs/>
+        </w:rPr>
+        <w:t>Yêu cầu:</w:t>
+      </w:r>
+    </w:p>
+    <w:p>
+      <w:pPr>
+        <w:rPr>
+          <w:rFonts w:ascii="Times New Roman" w:hAnsi="Times New Roman" w:cs="Times New Roman"/>
+        </w:rPr>
+      </w:pPr>
+      <w:r>
+        <w:rPr>
+          <w:rFonts w:ascii="Times New Roman" w:hAnsi="Times New Roman" w:cs="Times New Roman"/>
+        </w:rPr>
+        <w:t>Tạo một file index.html đơn giản và sử dụng nginx</w:t>
+      </w:r>
+      <w:proofErr w:type="gramStart"/>
+      <w:r>
+        <w:rPr>
+          <w:rFonts w:ascii="Times New Roman" w:hAnsi="Times New Roman" w:cs="Times New Roman"/>
+        </w:rPr>
+        <w:t>:latest</w:t>
+      </w:r>
+      <w:proofErr w:type="gramEnd"/>
+      <w:r>
+        <w:rPr>
+          <w:rFonts w:ascii="Times New Roman" w:hAnsi="Times New Roman" w:cs="Times New Roman"/>
+        </w:rPr>
+        <w:t xml:space="preserve"> để phục vụ trang web.</w:t>
+      </w:r>
+    </w:p>
+    <w:p>
+      <w:pPr>
+        <w:rPr>
+          <w:rFonts w:ascii="Times New Roman" w:hAnsi="Times New Roman" w:cs="Times New Roman"/>
+        </w:rPr>
+      </w:pPr>
+      <w:r>
+        <w:rPr>
+          <w:rFonts w:ascii="Times New Roman" w:hAnsi="Times New Roman" w:cs="Times New Roman"/>
+        </w:rPr>
+        <w:t>Bài 5: Tạo Dockerfile cho ứng dụng Go</w:t>
+      </w:r>
+    </w:p>
+    <w:p>
+      <w:pPr>
+        <w:rPr>
+          <w:rFonts w:ascii="Times New Roman" w:hAnsi="Times New Roman" w:cs="Times New Roman"/>
+          <w:b/>
+          <w:bCs/>
+          <w:i/>
+          <w:iCs/>
+        </w:rPr>
+      </w:pPr>
+      <w:r>
+        <w:rPr>
+          <w:rFonts w:ascii="Times New Roman" w:hAnsi="Times New Roman" w:cs="Times New Roman"/>
+          <w:b/>
+          <w:bCs/>
+          <w:i/>
+          <w:iCs/>
+        </w:rPr>
+        <w:t>Yêu cầu:</w:t>
+      </w:r>
+    </w:p>
+    <w:p>
+      <w:pPr>
+        <w:rPr>
+          <w:rFonts w:ascii="Times New Roman" w:hAnsi="Times New Roman" w:cs="Times New Roman"/>
+        </w:rPr>
+      </w:pPr>
+      <w:r>
+        <w:rPr>
+          <w:rFonts w:ascii="Times New Roman" w:hAnsi="Times New Roman" w:cs="Times New Roman"/>
+        </w:rPr>
+        <w:t>Viết Dockerfile để build và chạy một ứng dụng Go đơn giản.</w:t>
+      </w:r>
+    </w:p>
+    <w:p>
+      <w:pPr>
+        <w:rPr>
+          <w:rFonts w:ascii="Times New Roman" w:hAnsi="Times New Roman" w:cs="Times New Roman"/>
+        </w:rPr>
+      </w:pPr>
+      <w:r>
+        <w:rPr>
+          <w:rFonts w:ascii="Times New Roman" w:hAnsi="Times New Roman" w:cs="Times New Roman"/>
+        </w:rPr>
+        <w:t>Bài 6: Sử dụng Multi-stage Build trong Dockerfile</w:t>
+      </w:r>
+    </w:p>
+    <w:p>
+      <w:pPr>
+        <w:rPr>
+          <w:rFonts w:ascii="Times New Roman" w:hAnsi="Times New Roman" w:cs="Times New Roman"/>
+          <w:b/>
+          <w:bCs/>
+          <w:i/>
+          <w:iCs/>
+        </w:rPr>
+      </w:pPr>
+      <w:r>
+        <w:rPr>
+          <w:rFonts w:ascii="Times New Roman" w:hAnsi="Times New Roman" w:cs="Times New Roman"/>
+          <w:b/>
+          <w:bCs/>
+          <w:i/>
+          <w:iCs/>
+        </w:rPr>
+        <w:t>Viết Dockerfile để build một ứng dụng Node.js với hai stage:</w:t>
+      </w:r>
+    </w:p>
+    <w:p>
+      <w:pPr>
+        <w:rPr>
+          <w:rFonts w:ascii="Times New Roman" w:hAnsi="Times New Roman" w:cs="Times New Roman"/>
+          <w:i/>
+          <w:iCs/>
+        </w:rPr>
+      </w:pPr>
+      <w:r>
+        <w:rPr>
+          <w:rFonts w:ascii="Times New Roman" w:hAnsi="Times New Roman" w:cs="Times New Roman"/>
+          <w:i/>
+          <w:iCs/>
+        </w:rPr>
+        <w:lastRenderedPageBreak/>
+        <w:t>Stage 1: Dùng node</w:t>
+      </w:r>
+      <w:proofErr w:type="gramStart"/>
+      <w:r>
+        <w:rPr>
+          <w:rFonts w:ascii="Times New Roman" w:hAnsi="Times New Roman" w:cs="Times New Roman"/>
+          <w:i/>
+          <w:iCs/>
+        </w:rPr>
+        <w:t>:18</w:t>
+      </w:r>
+      <w:proofErr w:type="gramEnd"/>
+      <w:r>
+        <w:rPr>
+          <w:rFonts w:ascii="Times New Roman" w:hAnsi="Times New Roman" w:cs="Times New Roman"/>
+          <w:i/>
+          <w:iCs/>
+        </w:rPr>
+        <w:t xml:space="preserve"> để build code.</w:t>
+      </w:r>
+    </w:p>
+    <w:p>
+      <w:pPr>
+        <w:rPr>
+          <w:rFonts w:ascii="Times New Roman" w:hAnsi="Times New Roman" w:cs="Times New Roman"/>
+          <w:i/>
+          <w:iCs/>
+        </w:rPr>
+      </w:pPr>
+      <w:r>
+        <w:rPr>
+          <w:rFonts w:ascii="Times New Roman" w:hAnsi="Times New Roman" w:cs="Times New Roman"/>
+          <w:i/>
+          <w:iCs/>
+        </w:rPr>
+        <w:t>Stage 2: Dùng node</w:t>
+      </w:r>
+      <w:proofErr w:type="gramStart"/>
+      <w:r>
+        <w:rPr>
+          <w:rFonts w:ascii="Times New Roman" w:hAnsi="Times New Roman" w:cs="Times New Roman"/>
+          <w:i/>
+          <w:iCs/>
+        </w:rPr>
+        <w:t>:18</w:t>
+      </w:r>
+      <w:proofErr w:type="gramEnd"/>
+      <w:r>
+        <w:rPr>
+          <w:rFonts w:ascii="Times New Roman" w:hAnsi="Times New Roman" w:cs="Times New Roman"/>
+          <w:i/>
+          <w:iCs/>
+        </w:rPr>
+        <w:t>-alpine để chạy ứng dụng đã build.</w:t>
+      </w:r>
+    </w:p>
+    <w:p>
+      <w:pPr>
+        <w:rPr>
+          <w:rFonts w:ascii="Times New Roman" w:hAnsi="Times New Roman" w:cs="Times New Roman"/>
+        </w:rPr>
+      </w:pPr>
+      <w:r>
+        <w:rPr>
+          <w:rFonts w:ascii="Times New Roman" w:hAnsi="Times New Roman" w:cs="Times New Roman"/>
+        </w:rPr>
+        <w:t>Bài 7: Sử dụng biến môi trường trong Dockerfile</w:t>
+      </w:r>
+    </w:p>
+    <w:p>
+      <w:pPr>
+        <w:rPr>
+          <w:rFonts w:ascii="Times New Roman" w:hAnsi="Times New Roman" w:cs="Times New Roman"/>
+          <w:i/>
+          <w:iCs/>
+        </w:rPr>
+      </w:pPr>
+      <w:r>
+        <w:rPr>
+          <w:rFonts w:ascii="Times New Roman" w:hAnsi="Times New Roman" w:cs="Times New Roman"/>
+          <w:i/>
+          <w:iCs/>
+        </w:rPr>
+        <w:t>Yêu cầu:</w:t>
+      </w:r>
+    </w:p>
+    <w:p>
+      <w:pPr>
+        <w:rPr>
+          <w:rFonts w:ascii="Times New Roman" w:hAnsi="Times New Roman" w:cs="Times New Roman"/>
+        </w:rPr>
+      </w:pPr>
+      <w:r>
+        <w:rPr>
+          <w:rFonts w:ascii="Times New Roman" w:hAnsi="Times New Roman" w:cs="Times New Roman"/>
+        </w:rPr>
+        <w:t>Viết Dockerfile cho ứng dụng Python đọc biến môi trường APP_ENV và in ra màn hình.</w:t>
+      </w:r>
+    </w:p>
+    <w:p>
+      <w:pPr>
+        <w:rPr>
+          <w:rFonts w:ascii="Times New Roman" w:hAnsi="Times New Roman" w:cs="Times New Roman"/>
+        </w:rPr>
+      </w:pPr>
+      <w:r>
+        <w:rPr>
+          <w:rFonts w:ascii="Times New Roman" w:hAnsi="Times New Roman" w:cs="Times New Roman"/>
+        </w:rPr>
+        <w:t>Sử dụng ENV APP_ENV=development trong Dockerfile.</w:t>
+      </w:r>
+    </w:p>
+    <w:p>
+      <w:pPr>
+        <w:rPr>
+          <w:rFonts w:ascii="Times New Roman" w:hAnsi="Times New Roman" w:cs="Times New Roman"/>
+        </w:rPr>
+      </w:pPr>
+      <w:r>
+        <w:rPr>
+          <w:rFonts w:ascii="Times New Roman" w:hAnsi="Times New Roman" w:cs="Times New Roman"/>
+        </w:rPr>
+        <w:t>Bài 8: Tạo Dockerfile cho PostgreSQL tùy chỉnh</w:t>
+      </w:r>
+    </w:p>
+    <w:p>
+      <w:pPr>
+        <w:rPr>
+          <w:rFonts w:ascii="Times New Roman" w:hAnsi="Times New Roman" w:cs="Times New Roman"/>
+          <w:b/>
+          <w:bCs/>
+        </w:rPr>
+      </w:pPr>
+      <w:r>
+        <w:rPr>
+          <w:rFonts w:ascii="Times New Roman" w:hAnsi="Times New Roman" w:cs="Times New Roman"/>
+          <w:b/>
+          <w:bCs/>
+        </w:rPr>
+        <w:t>Yêu cầu:</w:t>
+      </w:r>
+    </w:p>
+    <w:p>
+      <w:pPr>
+        <w:rPr>
+          <w:rFonts w:ascii="Times New Roman" w:hAnsi="Times New Roman" w:cs="Times New Roman"/>
+        </w:rPr>
+      </w:pPr>
+      <w:r>
+        <w:rPr>
+          <w:rFonts w:ascii="Times New Roman" w:hAnsi="Times New Roman" w:cs="Times New Roman"/>
+        </w:rPr>
+        <w:t>Viết Dockerfile để chạy PostgreSQL (postgres</w:t>
+      </w:r>
+      <w:proofErr w:type="gramStart"/>
+      <w:r>
+        <w:rPr>
+          <w:rFonts w:ascii="Times New Roman" w:hAnsi="Times New Roman" w:cs="Times New Roman"/>
+        </w:rPr>
+        <w:t>:15</w:t>
+      </w:r>
+      <w:proofErr w:type="gramEnd"/>
+      <w:r>
+        <w:rPr>
+          <w:rFonts w:ascii="Times New Roman" w:hAnsi="Times New Roman" w:cs="Times New Roman"/>
+        </w:rPr>
+        <w:t>).</w:t>
+      </w:r>
+    </w:p>
+    <w:p>
+      <w:pPr>
+        <w:rPr>
+          <w:rFonts w:ascii="Times New Roman" w:hAnsi="Times New Roman" w:cs="Times New Roman"/>
+        </w:rPr>
+      </w:pPr>
+      <w:proofErr w:type="gramStart"/>
+      <w:r>
+        <w:rPr>
+          <w:rFonts w:ascii="Times New Roman" w:hAnsi="Times New Roman" w:cs="Times New Roman"/>
+        </w:rPr>
+        <w:t>Thêm</w:t>
+      </w:r>
+      <w:proofErr w:type="gramEnd"/>
+      <w:r>
+        <w:rPr>
+          <w:rFonts w:ascii="Times New Roman" w:hAnsi="Times New Roman" w:cs="Times New Roman"/>
+        </w:rPr>
+        <w:t xml:space="preserve"> file SQL để tự động tạo database khi container chạy lần đầu tiên.</w:t>
+      </w:r>
+    </w:p>
+    <w:p>
+      <w:pPr>
+        <w:rPr>
+          <w:rFonts w:ascii="Times New Roman" w:hAnsi="Times New Roman" w:cs="Times New Roman"/>
+        </w:rPr>
+      </w:pPr>
+      <w:r>
+        <w:rPr>
+          <w:rFonts w:ascii="Times New Roman" w:hAnsi="Times New Roman" w:cs="Times New Roman"/>
+        </w:rPr>
+        <w:t>Bài 9: Tạo Dockerfile chạy Redis với cấu hình tùy chỉnh</w:t>
+      </w:r>
+    </w:p>
+    <w:p>
+      <w:pPr>
+        <w:rPr>
+          <w:rFonts w:ascii="Times New Roman" w:hAnsi="Times New Roman" w:cs="Times New Roman"/>
+          <w:b/>
+          <w:bCs/>
+          <w:i/>
+          <w:iCs/>
+        </w:rPr>
+      </w:pPr>
+      <w:r>
+        <w:rPr>
+          <w:rFonts w:ascii="Times New Roman" w:hAnsi="Times New Roman" w:cs="Times New Roman"/>
+          <w:b/>
+          <w:bCs/>
+          <w:i/>
+          <w:iCs/>
+        </w:rPr>
+        <w:t>Yêu cầu:</w:t>
+      </w:r>
+    </w:p>
+    <w:p>
+      <w:pPr>
+        <w:rPr>
+          <w:rFonts w:ascii="Times New Roman" w:hAnsi="Times New Roman" w:cs="Times New Roman"/>
+        </w:rPr>
+      </w:pPr>
+      <w:r>
+        <w:rPr>
+          <w:rFonts w:ascii="Times New Roman" w:hAnsi="Times New Roman" w:cs="Times New Roman"/>
+        </w:rPr>
+        <w:t>Viết Dockerfile sử dụng redis</w:t>
+      </w:r>
+      <w:proofErr w:type="gramStart"/>
+      <w:r>
+        <w:rPr>
+          <w:rFonts w:ascii="Times New Roman" w:hAnsi="Times New Roman" w:cs="Times New Roman"/>
+        </w:rPr>
+        <w:t>:latest</w:t>
+      </w:r>
+      <w:proofErr w:type="gramEnd"/>
+      <w:r>
+        <w:rPr>
+          <w:rFonts w:ascii="Times New Roman" w:hAnsi="Times New Roman" w:cs="Times New Roman"/>
+        </w:rPr>
+        <w:t>.</w:t>
+      </w:r>
+    </w:p>
+    <w:p>
+      <w:pPr>
+        <w:rPr>
+          <w:rFonts w:ascii="Times New Roman" w:hAnsi="Times New Roman" w:cs="Times New Roman"/>
+        </w:rPr>
+      </w:pPr>
+      <w:proofErr w:type="gramStart"/>
+      <w:r>
+        <w:rPr>
+          <w:rFonts w:ascii="Times New Roman" w:hAnsi="Times New Roman" w:cs="Times New Roman"/>
+        </w:rPr>
+        <w:t>Thêm</w:t>
+      </w:r>
+      <w:proofErr w:type="gramEnd"/>
+      <w:r>
+        <w:rPr>
+          <w:rFonts w:ascii="Times New Roman" w:hAnsi="Times New Roman" w:cs="Times New Roman"/>
+        </w:rPr>
+        <w:t xml:space="preserve"> file redis.conf vào container.</w:t>
+      </w:r>
+    </w:p>
+    <w:p>
+      <w:pPr>
+        <w:rPr>
+          <w:rFonts w:ascii="Times New Roman" w:hAnsi="Times New Roman" w:cs="Times New Roman"/>
+        </w:rPr>
+      </w:pPr>
+      <w:r>
+        <w:rPr>
+          <w:rFonts w:ascii="Times New Roman" w:hAnsi="Times New Roman" w:cs="Times New Roman"/>
+        </w:rPr>
+        <w:t>Bài 10: Chạy ứng dụng PHP với Apache</w:t>
+      </w:r>
+    </w:p>
+    <w:p>
+      <w:pPr>
+        <w:rPr>
+          <w:rFonts w:ascii="Times New Roman" w:hAnsi="Times New Roman" w:cs="Times New Roman"/>
+          <w:i/>
+          <w:iCs/>
+        </w:rPr>
+      </w:pPr>
+      <w:r>
+        <w:rPr>
+          <w:rFonts w:ascii="Times New Roman" w:hAnsi="Times New Roman" w:cs="Times New Roman"/>
+          <w:i/>
+          <w:iCs/>
+        </w:rPr>
+        <w:t>Yêu cầu:</w:t>
+      </w:r>
+    </w:p>
+    <w:p>
+      <w:pPr>
+        <w:rPr>
+          <w:rFonts w:ascii="Times New Roman" w:hAnsi="Times New Roman" w:cs="Times New Roman"/>
+          <w:i/>
+          <w:iCs/>
+        </w:rPr>
+      </w:pPr>
+      <w:r>
+        <w:rPr>
+          <w:rFonts w:ascii="Times New Roman" w:hAnsi="Times New Roman" w:cs="Times New Roman"/>
+          <w:i/>
+          <w:iCs/>
+        </w:rPr>
+        <w:t>Viết Dockerfile để chạy một ứng dụng PHP đơn giản (php</w:t>
+      </w:r>
+      <w:proofErr w:type="gramStart"/>
+      <w:r>
+        <w:rPr>
+          <w:rFonts w:ascii="Times New Roman" w:hAnsi="Times New Roman" w:cs="Times New Roman"/>
+          <w:i/>
+          <w:iCs/>
+        </w:rPr>
+        <w:t>:8.2</w:t>
+      </w:r>
+      <w:proofErr w:type="gramEnd"/>
+      <w:r>
+        <w:rPr>
+          <w:rFonts w:ascii="Times New Roman" w:hAnsi="Times New Roman" w:cs="Times New Roman"/>
+          <w:i/>
+          <w:iCs/>
+        </w:rPr>
+        <w:t>-apache).</w:t>
+      </w:r>
+    </w:p>
+    <w:p>
+      <w:pPr>
+        <w:rPr>
+          <w:rFonts w:ascii="Times New Roman" w:eastAsia="Times New Roman" w:hAnsi="Times New Roman" w:cs="Times New Roman"/>
+          <w:bCs/>
+          <w:sz w:val="24"/>
+          <w:szCs w:val="24"/>
+        </w:rPr>
+      </w:pPr>
+      <w:r>
+        <w:rPr>
+          <w:rFonts w:ascii="Times New Roman" w:hAnsi="Times New Roman" w:cs="Times New Roman"/>
+          <w:i/>
+          <w:iCs/>
+        </w:rPr>
+        <w:t>Mount mã nguồn từ máy host vào container.</w:t>
+      </w:r>
+    </w:p>
+    <w:p>
+      <w:pPr>
+        <w:rPr>
+          <w:rFonts w:ascii="Times New Roman" w:hAnsi="Times New Roman" w:cs="Times New Roman"/>
+        </w:rPr>
+      </w:pPr>
     </w:p>
     <w:sectPr>
       <w:pgSz w:w="12240" w:h="15840"/>
@@ -17,6 +1601,103 @@
     </w:sectPr>
   </w:body>
 </w:document>
+</file>
+
+<file path=word/numbering.xml><?xml version="1.0" encoding="utf-8"?>
+<w:numbering xmlns:wpc="http://schemas.microsoft.com/office/word/2010/wordprocessingCanvas" xmlns:mc="http://schemas.openxmlformats.org/markup-compatibility/2006" xmlns:o="urn:schemas-microsoft-com:office:office" xmlns:r="http://schemas.openxmlformats.org/officeDocument/2006/relationships" xmlns:m="http://schemas.openxmlformats.org/officeDocument/2006/math" xmlns:v="urn:schemas-microsoft-com:vml" xmlns:wp14="http://schemas.microsoft.com/office/word/2010/wordprocessingDrawing" xmlns:wp="http://schemas.openxmlformats.org/drawingml/2006/wordprocessingDrawing" xmlns:w10="urn:schemas-microsoft-com:office:word" xmlns:w="http://schemas.openxmlformats.org/wordprocessingml/2006/main" xmlns:w14="http://schemas.microsoft.com/office/word/2010/wordml" xmlns:w15="http://schemas.microsoft.com/office/word/2012/wordml" xmlns:wpg="http://schemas.microsoft.com/office/word/2010/wordprocessingGroup" xmlns:wpi="http://schemas.microsoft.com/office/word/2010/wordprocessingInk" xmlns:wne="http://schemas.microsoft.com/office/word/2006/wordml" xmlns:wps="http://schemas.microsoft.com/office/word/2010/wordprocessingShape" mc:Ignorable="w14 w15 wp14">
+  <w:abstractNum w:abstractNumId="0">
+    <w:nsid w:val="4A980036"/>
+    <w:multiLevelType w:val="hybridMultilevel"/>
+    <w:tmpl w:val="DA5EC07A"/>
+    <w:lvl w:ilvl="0" w:tplc="0409000F">
+      <w:start w:val="1"/>
+      <w:numFmt w:val="decimal"/>
+      <w:lvlText w:val="%1."/>
+      <w:lvlJc w:val="left"/>
+      <w:pPr>
+        <w:ind w:left="720" w:hanging="360"/>
+      </w:pPr>
+      <w:rPr>
+        <w:rFonts w:hint="default"/>
+      </w:rPr>
+    </w:lvl>
+    <w:lvl w:ilvl="1" w:tplc="04090019" w:tentative="1">
+      <w:start w:val="1"/>
+      <w:numFmt w:val="lowerLetter"/>
+      <w:lvlText w:val="%2."/>
+      <w:lvlJc w:val="left"/>
+      <w:pPr>
+        <w:ind w:left="1440" w:hanging="360"/>
+      </w:pPr>
+    </w:lvl>
+    <w:lvl w:ilvl="2" w:tplc="0409001B" w:tentative="1">
+      <w:start w:val="1"/>
+      <w:numFmt w:val="lowerRoman"/>
+      <w:lvlText w:val="%3."/>
+      <w:lvlJc w:val="right"/>
+      <w:pPr>
+        <w:ind w:left="2160" w:hanging="180"/>
+      </w:pPr>
+    </w:lvl>
+    <w:lvl w:ilvl="3" w:tplc="0409000F" w:tentative="1">
+      <w:start w:val="1"/>
+      <w:numFmt w:val="decimal"/>
+      <w:lvlText w:val="%4."/>
+      <w:lvlJc w:val="left"/>
+      <w:pPr>
+        <w:ind w:left="2880" w:hanging="360"/>
+      </w:pPr>
+    </w:lvl>
+    <w:lvl w:ilvl="4" w:tplc="04090019" w:tentative="1">
+      <w:start w:val="1"/>
+      <w:numFmt w:val="lowerLetter"/>
+      <w:lvlText w:val="%5."/>
+      <w:lvlJc w:val="left"/>
+      <w:pPr>
+        <w:ind w:left="3600" w:hanging="360"/>
+      </w:pPr>
+    </w:lvl>
+    <w:lvl w:ilvl="5" w:tplc="0409001B" w:tentative="1">
+      <w:start w:val="1"/>
+      <w:numFmt w:val="lowerRoman"/>
+      <w:lvlText w:val="%6."/>
+      <w:lvlJc w:val="right"/>
+      <w:pPr>
+        <w:ind w:left="4320" w:hanging="180"/>
+      </w:pPr>
+    </w:lvl>
+    <w:lvl w:ilvl="6" w:tplc="0409000F" w:tentative="1">
+      <w:start w:val="1"/>
+      <w:numFmt w:val="decimal"/>
+      <w:lvlText w:val="%7."/>
+      <w:lvlJc w:val="left"/>
+      <w:pPr>
+        <w:ind w:left="5040" w:hanging="360"/>
+      </w:pPr>
+    </w:lvl>
+    <w:lvl w:ilvl="7" w:tplc="04090019" w:tentative="1">
+      <w:start w:val="1"/>
+      <w:numFmt w:val="lowerLetter"/>
+      <w:lvlText w:val="%8."/>
+      <w:lvlJc w:val="left"/>
+      <w:pPr>
+        <w:ind w:left="5760" w:hanging="360"/>
+      </w:pPr>
+    </w:lvl>
+    <w:lvl w:ilvl="8" w:tplc="0409001B" w:tentative="1">
+      <w:start w:val="1"/>
+      <w:numFmt w:val="lowerRoman"/>
+      <w:lvlText w:val="%9."/>
+      <w:lvlJc w:val="right"/>
+      <w:pPr>
+        <w:ind w:left="6480" w:hanging="180"/>
+      </w:pPr>
+    </w:lvl>
+  </w:abstractNum>
+  <w:num w:numId="1">
+    <w:abstractNumId w:val="0"/>
+  </w:num>
+</w:numbering>
 </file>
 
 <file path=word/styles.xml><?xml version="1.0" encoding="utf-8"?>
@@ -440,6 +2121,17 @@
     <w:semiHidden/>
     <w:unhideWhenUsed/>
   </w:style>
+  <w:style w:type="paragraph" w:styleId="ListParagraph">
+    <w:name w:val="List Paragraph"/>
+    <w:basedOn w:val="Normal"/>
+    <w:uiPriority w:val="34"/>
+    <w:qFormat/>
+    <w:rsid w:val="00F17729"/>
+    <w:pPr>
+      <w:ind w:left="720"/>
+      <w:contextualSpacing/>
+    </w:pPr>
+  </w:style>
 </w:styles>
 </file>
 

</xml_diff>

<commit_message>
bai 2 phan 2 dockerfile
</commit_message>
<xml_diff>
--- a/Lab4/MinhChungTuan04.docx
+++ b/Lab4/MinhChungTuan04.docx
@@ -69,34 +69,23 @@
         <w:rPr>
           <w:rFonts w:ascii="Times New Roman" w:hAnsi="Times New Roman" w:cs="Times New Roman"/>
         </w:rPr>
-        <w:t xml:space="preserve">docker </w:t>
-      </w:r>
-      <w:r>
-        <w:rPr>
-          <w:rFonts w:ascii="Times New Roman" w:hAnsi="Times New Roman" w:cs="Times New Roman"/>
-        </w:rPr>
-        <w:t>–</w:t>
-      </w:r>
-      <w:r>
-        <w:rPr>
-          <w:rFonts w:ascii="Times New Roman" w:hAnsi="Times New Roman" w:cs="Times New Roman"/>
-        </w:rPr>
-        <w:t>version</w:t>
-      </w:r>
-    </w:p>
-    <w:p>
-      <w:pPr>
-        <w:rPr>
-          <w:rFonts w:ascii="Times New Roman" w:eastAsia="Times New Roman" w:hAnsi="Times New Roman" w:cs="Times New Roman"/>
-          <w:bCs/>
-          <w:sz w:val="24"/>
-          <w:szCs w:val="24"/>
-        </w:rPr>
-      </w:pPr>
-      <w:r>
-        <w:rPr>
-          <w:rFonts w:ascii="Times New Roman" w:eastAsia="Times New Roman" w:hAnsi="Times New Roman" w:cs="Times New Roman"/>
-          <w:bCs/>
+        <w:t>docker –version</w:t>
+      </w:r>
+    </w:p>
+    <w:p>
+      <w:pPr>
+        <w:rPr>
+          <w:rFonts w:ascii="Times New Roman" w:eastAsia="Times New Roman" w:hAnsi="Times New Roman" w:cs="Times New Roman"/>
+          <w:bCs/>
+          <w:sz w:val="24"/>
+          <w:szCs w:val="24"/>
+        </w:rPr>
+      </w:pPr>
+      <w:r>
+        <w:rPr>
+          <w:rFonts w:ascii="Times New Roman" w:eastAsia="Times New Roman" w:hAnsi="Times New Roman" w:cs="Times New Roman"/>
+          <w:bCs/>
+          <w:noProof/>
           <w:sz w:val="24"/>
           <w:szCs w:val="24"/>
         </w:rPr>
@@ -270,19 +259,7 @@
         <w:rPr>
           <w:rFonts w:ascii="Times New Roman" w:hAnsi="Times New Roman" w:cs="Times New Roman"/>
         </w:rPr>
-        <w:t xml:space="preserve">docker ps </w:t>
-      </w:r>
-      <w:r>
-        <w:rPr>
-          <w:rFonts w:ascii="Times New Roman" w:hAnsi="Times New Roman" w:cs="Times New Roman"/>
-        </w:rPr>
-        <w:t>–</w:t>
-      </w:r>
-      <w:r>
-        <w:rPr>
-          <w:rFonts w:ascii="Times New Roman" w:hAnsi="Times New Roman" w:cs="Times New Roman"/>
-        </w:rPr>
-        <w:t>a</w:t>
+        <w:t>docker ps –a</w:t>
       </w:r>
     </w:p>
     <w:p>
@@ -450,19 +427,7 @@
         <w:rPr>
           <w:rFonts w:ascii="Times New Roman" w:hAnsi="Times New Roman" w:cs="Times New Roman"/>
         </w:rPr>
-        <w:t xml:space="preserve">docker image prune </w:t>
-      </w:r>
-      <w:r>
-        <w:rPr>
-          <w:rFonts w:ascii="Times New Roman" w:hAnsi="Times New Roman" w:cs="Times New Roman"/>
-        </w:rPr>
-        <w:t>–</w:t>
-      </w:r>
-      <w:r>
-        <w:rPr>
-          <w:rFonts w:ascii="Times New Roman" w:hAnsi="Times New Roman" w:cs="Times New Roman"/>
-        </w:rPr>
-        <w:t>a</w:t>
+        <w:t>docker image prune –a</w:t>
       </w:r>
     </w:p>
     <w:p>
@@ -757,19 +722,7 @@
         <w:rPr>
           <w:rFonts w:ascii="Times New Roman" w:hAnsi="Times New Roman" w:cs="Times New Roman"/>
         </w:rPr>
-        <w:t>FROM nginx</w:t>
-      </w:r>
-      <w:r>
-        <w:rPr>
-          <w:rFonts w:ascii="Times New Roman" w:hAnsi="Times New Roman" w:cs="Times New Roman"/>
-        </w:rPr>
-        <w:t xml:space="preserve"> </w:t>
-      </w:r>
-      <w:r>
-        <w:rPr>
-          <w:rFonts w:ascii="Times New Roman" w:hAnsi="Times New Roman" w:cs="Times New Roman"/>
-        </w:rPr>
-        <w:t>COPY index.html /usr/share/nginx/html/index.html</w:t>
+        <w:t>FROM nginx COPY index.html /usr/share/nginx/html/index.html</w:t>
       </w:r>
     </w:p>
     <w:p>
@@ -847,34 +800,133 @@
           <w:rFonts w:ascii="Times New Roman" w:hAnsi="Times New Roman" w:cs="Times New Roman"/>
         </w:rPr>
       </w:pPr>
+      <w:r>
+        <w:rPr>
+          <w:rFonts w:ascii="Times New Roman" w:eastAsia="Times New Roman" w:hAnsi="Times New Roman" w:cs="Times New Roman"/>
+          <w:bCs/>
+          <w:sz w:val="24"/>
+          <w:szCs w:val="24"/>
+        </w:rPr>
+        <w:t xml:space="preserve">Bài 1: </w:t>
+      </w:r>
+      <w:r>
+        <w:rPr>
+          <w:rFonts w:ascii="Times New Roman" w:hAnsi="Times New Roman" w:cs="Times New Roman"/>
+        </w:rPr>
+        <w:t>Tạo Dockerfile chạy một ứng dụng Node.js đơn giản</w:t>
+      </w:r>
+    </w:p>
+    <w:p>
+      <w:pPr>
+        <w:rPr>
+          <w:rFonts w:ascii="Times New Roman" w:hAnsi="Times New Roman" w:cs="Times New Roman"/>
+          <w:b/>
+          <w:bCs/>
+          <w:i/>
+          <w:iCs/>
+        </w:rPr>
+      </w:pPr>
+      <w:r>
+        <w:rPr>
+          <w:rFonts w:ascii="Times New Roman" w:hAnsi="Times New Roman" w:cs="Times New Roman"/>
+          <w:b/>
+          <w:bCs/>
+          <w:i/>
+          <w:iCs/>
+        </w:rPr>
+        <w:t>Yêu cầu:</w:t>
+      </w:r>
+    </w:p>
+    <w:p>
+      <w:pPr>
+        <w:rPr>
+          <w:rFonts w:ascii="Times New Roman" w:hAnsi="Times New Roman" w:cs="Times New Roman"/>
+        </w:rPr>
+      </w:pPr>
+      <w:r>
+        <w:rPr>
+          <w:rFonts w:ascii="Times New Roman" w:hAnsi="Times New Roman" w:cs="Times New Roman"/>
+        </w:rPr>
+        <w:t>Viết Dockerfile để chạy một ứng dụng Node.js hiển thị "Hello, Docker!" trên cổng 3000.</w:t>
+      </w:r>
+    </w:p>
+    <w:p>
+      <w:pPr>
+        <w:rPr>
+          <w:rFonts w:ascii="Times New Roman" w:hAnsi="Times New Roman" w:cs="Times New Roman"/>
+        </w:rPr>
+      </w:pPr>
+      <w:r>
+        <w:rPr>
+          <w:rFonts w:ascii="Times New Roman" w:hAnsi="Times New Roman" w:cs="Times New Roman"/>
+        </w:rPr>
+        <w:t>Sử dụng node</w:t>
+      </w:r>
+      <w:proofErr w:type="gramStart"/>
+      <w:r>
+        <w:rPr>
+          <w:rFonts w:ascii="Times New Roman" w:hAnsi="Times New Roman" w:cs="Times New Roman"/>
+        </w:rPr>
+        <w:t>:18</w:t>
+      </w:r>
+      <w:proofErr w:type="gramEnd"/>
+      <w:r>
+        <w:rPr>
+          <w:rFonts w:ascii="Times New Roman" w:hAnsi="Times New Roman" w:cs="Times New Roman"/>
+        </w:rPr>
+        <w:t xml:space="preserve"> làm base image.</w:t>
+      </w:r>
+    </w:p>
+    <w:p>
+      <w:pPr>
+        <w:rPr>
+          <w:rFonts w:ascii="Times New Roman" w:hAnsi="Times New Roman" w:cs="Times New Roman"/>
+        </w:rPr>
+      </w:pPr>
+      <w:r>
+        <w:rPr>
+          <w:rFonts w:ascii="Times New Roman" w:hAnsi="Times New Roman" w:cs="Times New Roman"/>
+        </w:rPr>
+        <w:t>Bài 2: Tạo Dockerfile chạy một ứng dụng Python Flask</w:t>
+      </w:r>
+    </w:p>
+    <w:p>
+      <w:pPr>
+        <w:rPr>
+          <w:rFonts w:ascii="Times New Roman" w:hAnsi="Times New Roman" w:cs="Times New Roman"/>
+          <w:b/>
+          <w:bCs/>
+          <w:i/>
+          <w:iCs/>
+        </w:rPr>
+      </w:pPr>
       <w:bookmarkStart w:id="0" w:name="_GoBack"/>
       <w:r>
         <w:rPr>
-          <w:rFonts w:ascii="Times New Roman" w:eastAsia="Times New Roman" w:hAnsi="Times New Roman" w:cs="Times New Roman"/>
-          <w:bCs/>
-          <w:sz w:val="24"/>
-          <w:szCs w:val="24"/>
-        </w:rPr>
-        <w:t xml:space="preserve">Bài 1: </w:t>
-      </w:r>
-      <w:r>
-        <w:rPr>
-          <w:rFonts w:ascii="Times New Roman" w:hAnsi="Times New Roman" w:cs="Times New Roman"/>
-        </w:rPr>
-        <w:t>Tạo Dockerfile chạy một ứng dụng Node.js đơn giản</w:t>
-      </w:r>
-    </w:p>
-    <w:p>
-      <w:pPr>
-        <w:rPr>
           <w:rFonts w:ascii="Times New Roman" w:hAnsi="Times New Roman" w:cs="Times New Roman"/>
           <w:b/>
           <w:bCs/>
           <w:i/>
           <w:iCs/>
         </w:rPr>
-      </w:pPr>
-      <w:r>
+        <w:t>Yêu cầu:</w:t>
+      </w:r>
+    </w:p>
+    <w:p>
+      <w:pPr>
+        <w:rPr>
+          <w:rFonts w:ascii="Arial" w:hAnsi="Arial" w:cs="Arial"/>
+        </w:rPr>
+      </w:pPr>
+      <w:r>
+        <w:rPr>
+          <w:rFonts w:ascii="Arial" w:hAnsi="Arial" w:cs="Arial"/>
+        </w:rPr>
+        <w:t>Viết Dockerfile để chạy một ứng dụng Flask hiển thị "Hello, Docker Flask!" trên cổng 5000.</w:t>
+      </w:r>
+    </w:p>
+    <w:p>
+      <w:pPr>
         <w:rPr>
           <w:rFonts w:ascii="Times New Roman" w:hAnsi="Times New Roman" w:cs="Times New Roman"/>
           <w:b/>
@@ -882,124 +934,29 @@
           <w:i/>
           <w:iCs/>
         </w:rPr>
-        <w:t>Yêu cầu:</w:t>
-      </w:r>
-    </w:p>
-    <w:p>
-      <w:pPr>
-        <w:rPr>
-          <w:rFonts w:ascii="Times New Roman" w:hAnsi="Times New Roman" w:cs="Times New Roman"/>
-        </w:rPr>
-      </w:pPr>
-      <w:r>
-        <w:rPr>
-          <w:rFonts w:ascii="Times New Roman" w:hAnsi="Times New Roman" w:cs="Times New Roman"/>
-        </w:rPr>
-        <w:t>Viết Dockerfile để chạy một ứng dụng Node.js hiển thị "Hello, Docker!" trên cổng 3000.</w:t>
-      </w:r>
-    </w:p>
-    <w:p>
-      <w:pPr>
-        <w:rPr>
-          <w:rFonts w:ascii="Times New Roman" w:hAnsi="Times New Roman" w:cs="Times New Roman"/>
-        </w:rPr>
-      </w:pPr>
-      <w:r>
-        <w:rPr>
-          <w:rFonts w:ascii="Times New Roman" w:hAnsi="Times New Roman" w:cs="Times New Roman"/>
-        </w:rPr>
-        <w:t>Sử dụng node</w:t>
+      </w:pPr>
+      <w:r>
+        <w:rPr>
+          <w:rFonts w:ascii="Arial" w:hAnsi="Arial" w:cs="Arial"/>
+        </w:rPr>
+        <w:t>Sử dụng python</w:t>
       </w:r>
       <w:proofErr w:type="gramStart"/>
       <w:r>
         <w:rPr>
-          <w:rFonts w:ascii="Times New Roman" w:hAnsi="Times New Roman" w:cs="Times New Roman"/>
-        </w:rPr>
-        <w:t>:18</w:t>
+          <w:rFonts w:ascii="Arial" w:hAnsi="Arial" w:cs="Arial"/>
+        </w:rPr>
+        <w:t>:3.9</w:t>
       </w:r>
       <w:proofErr w:type="gramEnd"/>
       <w:r>
         <w:rPr>
-          <w:rFonts w:ascii="Times New Roman" w:hAnsi="Times New Roman" w:cs="Times New Roman"/>
+          <w:rFonts w:ascii="Arial" w:hAnsi="Arial" w:cs="Arial"/>
         </w:rPr>
         <w:t xml:space="preserve"> làm base image.</w:t>
       </w:r>
     </w:p>
     <w:bookmarkEnd w:id="0"/>
-    <w:p>
-      <w:pPr>
-        <w:rPr>
-          <w:rFonts w:ascii="Times New Roman" w:hAnsi="Times New Roman" w:cs="Times New Roman"/>
-        </w:rPr>
-      </w:pPr>
-      <w:r>
-        <w:rPr>
-          <w:rFonts w:ascii="Times New Roman" w:hAnsi="Times New Roman" w:cs="Times New Roman"/>
-        </w:rPr>
-        <w:t>Bài 2: Tạo Dockerfile chạy một ứng dụng Python Flask</w:t>
-      </w:r>
-    </w:p>
-    <w:p>
-      <w:pPr>
-        <w:rPr>
-          <w:rFonts w:ascii="Times New Roman" w:hAnsi="Times New Roman" w:cs="Times New Roman"/>
-          <w:b/>
-          <w:bCs/>
-          <w:i/>
-          <w:iCs/>
-        </w:rPr>
-      </w:pPr>
-      <w:r>
-        <w:rPr>
-          <w:rFonts w:ascii="Times New Roman" w:hAnsi="Times New Roman" w:cs="Times New Roman"/>
-          <w:b/>
-          <w:bCs/>
-          <w:i/>
-          <w:iCs/>
-        </w:rPr>
-        <w:t>Yêu cầu:</w:t>
-      </w:r>
-    </w:p>
-    <w:p>
-      <w:pPr>
-        <w:rPr>
-          <w:rFonts w:ascii="Times New Roman" w:hAnsi="Times New Roman" w:cs="Times New Roman"/>
-        </w:rPr>
-      </w:pPr>
-      <w:r>
-        <w:rPr>
-          <w:rFonts w:ascii="Times New Roman" w:hAnsi="Times New Roman" w:cs="Times New Roman"/>
-        </w:rPr>
-        <w:t>Viết Dockerfile để build và chạy một ứng dụng React.</w:t>
-      </w:r>
-    </w:p>
-    <w:p>
-      <w:pPr>
-        <w:rPr>
-          <w:rFonts w:ascii="Times New Roman" w:hAnsi="Times New Roman" w:cs="Times New Roman"/>
-        </w:rPr>
-      </w:pPr>
-      <w:r>
-        <w:rPr>
-          <w:rFonts w:ascii="Times New Roman" w:hAnsi="Times New Roman" w:cs="Times New Roman"/>
-        </w:rPr>
-        <w:t>Sử dụng node</w:t>
-      </w:r>
-      <w:proofErr w:type="gramStart"/>
-      <w:r>
-        <w:rPr>
-          <w:rFonts w:ascii="Times New Roman" w:hAnsi="Times New Roman" w:cs="Times New Roman"/>
-        </w:rPr>
-        <w:t>:18</w:t>
-      </w:r>
-      <w:proofErr w:type="gramEnd"/>
-      <w:r>
-        <w:rPr>
-          <w:rFonts w:ascii="Times New Roman" w:hAnsi="Times New Roman" w:cs="Times New Roman"/>
-        </w:rPr>
-        <w:t>-alpine làm base image.</w:t>
-      </w:r>
-    </w:p>
     <w:p>
       <w:pPr>
         <w:rPr>

</xml_diff>